<commit_message>
update sep 9 26
</commit_message>
<xml_diff>
--- a/Notebook/L1 - Intro.docx
+++ b/Notebook/L1 - Intro.docx
@@ -7,14 +7,14 @@
         <w:pStyle w:val="2"/>
         <w:rPr>
           <w:rFonts w:hint="default"/>
-          <w:color w:val="FF0000"/>
+          <w:color w:val="00B0F0"/>
           <w:lang w:val="en-US"/>
         </w:rPr>
       </w:pPr>
       <w:r>
         <w:rPr>
           <w:rFonts w:hint="default"/>
-          <w:color w:val="FF0000"/>
+          <w:color w:val="00B0F0"/>
           <w:lang w:val="en-US"/>
         </w:rPr>
         <w:t>Được tóm tắt qua 1 lượt bằng Gemini rồi tự thêm, sửa, xóa lại theo giọng văn của mình :)</w:t>
@@ -192,6 +192,7 @@
     <w:p>
       <w:pPr>
         <w:numPr>
+          <w:ilvl w:val="0"/>
           <w:numId w:val="0"/>
         </w:numPr>
         <w:ind w:leftChars="0"/>
@@ -249,6 +250,8 @@
           </wp:inline>
         </w:drawing>
       </w:r>
+      <w:bookmarkStart w:id="0" w:name="_GoBack"/>
+      <w:bookmarkEnd w:id="0"/>
     </w:p>
     <w:p>
       <w:pPr>
@@ -270,6 +273,7 @@
       <w:pPr>
         <w:pStyle w:val="24"/>
         <w:numPr>
+          <w:ilvl w:val="0"/>
           <w:numId w:val="0"/>
         </w:numPr>
         <w:spacing w:after="200" w:line="276" w:lineRule="auto"/>
@@ -471,6 +475,7 @@
       <w:pPr>
         <w:pStyle w:val="24"/>
         <w:numPr>
+          <w:ilvl w:val="0"/>
           <w:numId w:val="0"/>
         </w:numPr>
       </w:pPr>
@@ -523,12 +528,11 @@
       <w:pPr>
         <w:pStyle w:val="23"/>
         <w:numPr>
+          <w:ilvl w:val="0"/>
           <w:numId w:val="0"/>
         </w:numPr>
         <w:ind w:leftChars="0"/>
       </w:pPr>
-      <w:bookmarkStart w:id="0" w:name="_GoBack"/>
-      <w:bookmarkEnd w:id="0"/>
     </w:p>
     <w:sectPr>
       <w:pgSz w:w="12240" w:h="15840"/>
@@ -821,7 +825,7 @@
     <w:lsdException w:qFormat="1" w:unhideWhenUsed="0" w:uiPriority="10" w:semiHidden="0" w:name="Title"/>
     <w:lsdException w:uiPriority="99" w:name="Closing"/>
     <w:lsdException w:uiPriority="99" w:name="Signature"/>
-    <w:lsdException w:uiPriority="1" w:name="Default Paragraph Font"/>
+    <w:lsdException w:qFormat="1" w:uiPriority="1" w:name="Default Paragraph Font"/>
     <w:lsdException w:uiPriority="99" w:semiHidden="0" w:name="Body Text"/>
     <w:lsdException w:uiPriority="99" w:name="Body Text Indent"/>
     <w:lsdException w:uiPriority="99" w:semiHidden="0" w:name="List Continue"/>
@@ -908,12 +912,12 @@
     <w:lsdException w:uiPriority="99" w:name="Table Theme"/>
     <w:lsdException w:qFormat="1" w:unhideWhenUsed="0" w:uiPriority="1" w:semiHidden="0" w:name="No Spacing"/>
     <w:lsdException w:unhideWhenUsed="0" w:uiPriority="60" w:semiHidden="0" w:name="Light Shading"/>
-    <w:lsdException w:unhideWhenUsed="0" w:uiPriority="61" w:semiHidden="0" w:name="Light List"/>
-    <w:lsdException w:unhideWhenUsed="0" w:uiPriority="62" w:semiHidden="0" w:name="Light Grid"/>
-    <w:lsdException w:unhideWhenUsed="0" w:uiPriority="63" w:semiHidden="0" w:name="Medium Shading 1"/>
-    <w:lsdException w:unhideWhenUsed="0" w:uiPriority="64" w:semiHidden="0" w:name="Medium Shading 2"/>
-    <w:lsdException w:unhideWhenUsed="0" w:uiPriority="65" w:semiHidden="0" w:name="Medium List 1"/>
-    <w:lsdException w:unhideWhenUsed="0" w:uiPriority="66" w:semiHidden="0" w:name="Medium List 2"/>
+    <w:lsdException w:qFormat="1" w:unhideWhenUsed="0" w:uiPriority="61" w:semiHidden="0" w:name="Light List"/>
+    <w:lsdException w:qFormat="1" w:unhideWhenUsed="0" w:uiPriority="62" w:semiHidden="0" w:name="Light Grid"/>
+    <w:lsdException w:qFormat="1" w:unhideWhenUsed="0" w:uiPriority="63" w:semiHidden="0" w:name="Medium Shading 1"/>
+    <w:lsdException w:qFormat="1" w:unhideWhenUsed="0" w:uiPriority="64" w:semiHidden="0" w:name="Medium Shading 2"/>
+    <w:lsdException w:qFormat="1" w:unhideWhenUsed="0" w:uiPriority="65" w:semiHidden="0" w:name="Medium List 1"/>
+    <w:lsdException w:qFormat="1" w:unhideWhenUsed="0" w:uiPriority="66" w:semiHidden="0" w:name="Medium List 2"/>
     <w:lsdException w:unhideWhenUsed="0" w:uiPriority="67" w:semiHidden="0" w:name="Medium Grid 1"/>
     <w:lsdException w:unhideWhenUsed="0" w:uiPriority="68" w:semiHidden="0" w:name="Medium Grid 2"/>
     <w:lsdException w:unhideWhenUsed="0" w:uiPriority="69" w:semiHidden="0" w:name="Medium Grid 3"/>
@@ -922,15 +926,15 @@
     <w:lsdException w:unhideWhenUsed="0" w:uiPriority="72" w:semiHidden="0" w:name="Colorful List"/>
     <w:lsdException w:unhideWhenUsed="0" w:uiPriority="73" w:semiHidden="0" w:name="Colorful Grid"/>
     <w:lsdException w:unhideWhenUsed="0" w:uiPriority="60" w:semiHidden="0" w:name="Light Shading Accent 1"/>
-    <w:lsdException w:unhideWhenUsed="0" w:uiPriority="61" w:semiHidden="0" w:name="Light List Accent 1"/>
-    <w:lsdException w:unhideWhenUsed="0" w:uiPriority="62" w:semiHidden="0" w:name="Light Grid Accent 1"/>
-    <w:lsdException w:unhideWhenUsed="0" w:uiPriority="63" w:semiHidden="0" w:name="Medium Shading 1 Accent 1"/>
-    <w:lsdException w:unhideWhenUsed="0" w:uiPriority="64" w:semiHidden="0" w:name="Medium Shading 2 Accent 1"/>
-    <w:lsdException w:unhideWhenUsed="0" w:uiPriority="65" w:semiHidden="0" w:name="Medium List 1 Accent 1"/>
+    <w:lsdException w:qFormat="1" w:unhideWhenUsed="0" w:uiPriority="61" w:semiHidden="0" w:name="Light List Accent 1"/>
+    <w:lsdException w:qFormat="1" w:unhideWhenUsed="0" w:uiPriority="62" w:semiHidden="0" w:name="Light Grid Accent 1"/>
+    <w:lsdException w:qFormat="1" w:unhideWhenUsed="0" w:uiPriority="63" w:semiHidden="0" w:name="Medium Shading 1 Accent 1"/>
+    <w:lsdException w:qFormat="1" w:unhideWhenUsed="0" w:uiPriority="64" w:semiHidden="0" w:name="Medium Shading 2 Accent 1"/>
+    <w:lsdException w:qFormat="1" w:unhideWhenUsed="0" w:uiPriority="65" w:semiHidden="0" w:name="Medium List 1 Accent 1"/>
     <w:lsdException w:qFormat="1" w:unhideWhenUsed="0" w:uiPriority="34" w:semiHidden="0" w:name="List Paragraph"/>
     <w:lsdException w:qFormat="1" w:unhideWhenUsed="0" w:uiPriority="29" w:semiHidden="0" w:name="Quote"/>
     <w:lsdException w:qFormat="1" w:unhideWhenUsed="0" w:uiPriority="30" w:semiHidden="0" w:name="Intense Quote"/>
-    <w:lsdException w:unhideWhenUsed="0" w:uiPriority="66" w:semiHidden="0" w:name="Medium List 2 Accent 1"/>
+    <w:lsdException w:qFormat="1" w:unhideWhenUsed="0" w:uiPriority="66" w:semiHidden="0" w:name="Medium List 2 Accent 1"/>
     <w:lsdException w:unhideWhenUsed="0" w:uiPriority="67" w:semiHidden="0" w:name="Medium Grid 1 Accent 1"/>
     <w:lsdException w:unhideWhenUsed="0" w:uiPriority="68" w:semiHidden="0" w:name="Medium Grid 2 Accent 1"/>
     <w:lsdException w:unhideWhenUsed="0" w:uiPriority="69" w:semiHidden="0" w:name="Medium Grid 3 Accent 1"/>
@@ -939,12 +943,12 @@
     <w:lsdException w:unhideWhenUsed="0" w:uiPriority="72" w:semiHidden="0" w:name="Colorful List Accent 1"/>
     <w:lsdException w:unhideWhenUsed="0" w:uiPriority="73" w:semiHidden="0" w:name="Colorful Grid Accent 1"/>
     <w:lsdException w:unhideWhenUsed="0" w:uiPriority="60" w:semiHidden="0" w:name="Light Shading Accent 2"/>
-    <w:lsdException w:unhideWhenUsed="0" w:uiPriority="61" w:semiHidden="0" w:name="Light List Accent 2"/>
-    <w:lsdException w:unhideWhenUsed="0" w:uiPriority="62" w:semiHidden="0" w:name="Light Grid Accent 2"/>
-    <w:lsdException w:unhideWhenUsed="0" w:uiPriority="63" w:semiHidden="0" w:name="Medium Shading 1 Accent 2"/>
-    <w:lsdException w:unhideWhenUsed="0" w:uiPriority="64" w:semiHidden="0" w:name="Medium Shading 2 Accent 2"/>
-    <w:lsdException w:unhideWhenUsed="0" w:uiPriority="65" w:semiHidden="0" w:name="Medium List 1 Accent 2"/>
-    <w:lsdException w:unhideWhenUsed="0" w:uiPriority="66" w:semiHidden="0" w:name="Medium List 2 Accent 2"/>
+    <w:lsdException w:qFormat="1" w:unhideWhenUsed="0" w:uiPriority="61" w:semiHidden="0" w:name="Light List Accent 2"/>
+    <w:lsdException w:qFormat="1" w:unhideWhenUsed="0" w:uiPriority="62" w:semiHidden="0" w:name="Light Grid Accent 2"/>
+    <w:lsdException w:qFormat="1" w:unhideWhenUsed="0" w:uiPriority="63" w:semiHidden="0" w:name="Medium Shading 1 Accent 2"/>
+    <w:lsdException w:qFormat="1" w:unhideWhenUsed="0" w:uiPriority="64" w:semiHidden="0" w:name="Medium Shading 2 Accent 2"/>
+    <w:lsdException w:qFormat="1" w:unhideWhenUsed="0" w:uiPriority="65" w:semiHidden="0" w:name="Medium List 1 Accent 2"/>
+    <w:lsdException w:qFormat="1" w:unhideWhenUsed="0" w:uiPriority="66" w:semiHidden="0" w:name="Medium List 2 Accent 2"/>
     <w:lsdException w:unhideWhenUsed="0" w:uiPriority="67" w:semiHidden="0" w:name="Medium Grid 1 Accent 2"/>
     <w:lsdException w:unhideWhenUsed="0" w:uiPriority="68" w:semiHidden="0" w:name="Medium Grid 2 Accent 2"/>
     <w:lsdException w:unhideWhenUsed="0" w:uiPriority="69" w:semiHidden="0" w:name="Medium Grid 3 Accent 2"/>
@@ -953,12 +957,12 @@
     <w:lsdException w:unhideWhenUsed="0" w:uiPriority="72" w:semiHidden="0" w:name="Colorful List Accent 2"/>
     <w:lsdException w:unhideWhenUsed="0" w:uiPriority="73" w:semiHidden="0" w:name="Colorful Grid Accent 2"/>
     <w:lsdException w:unhideWhenUsed="0" w:uiPriority="60" w:semiHidden="0" w:name="Light Shading Accent 3"/>
-    <w:lsdException w:unhideWhenUsed="0" w:uiPriority="61" w:semiHidden="0" w:name="Light List Accent 3"/>
-    <w:lsdException w:unhideWhenUsed="0" w:uiPriority="62" w:semiHidden="0" w:name="Light Grid Accent 3"/>
-    <w:lsdException w:unhideWhenUsed="0" w:uiPriority="63" w:semiHidden="0" w:name="Medium Shading 1 Accent 3"/>
-    <w:lsdException w:unhideWhenUsed="0" w:uiPriority="64" w:semiHidden="0" w:name="Medium Shading 2 Accent 3"/>
-    <w:lsdException w:unhideWhenUsed="0" w:uiPriority="65" w:semiHidden="0" w:name="Medium List 1 Accent 3"/>
-    <w:lsdException w:unhideWhenUsed="0" w:uiPriority="66" w:semiHidden="0" w:name="Medium List 2 Accent 3"/>
+    <w:lsdException w:qFormat="1" w:unhideWhenUsed="0" w:uiPriority="61" w:semiHidden="0" w:name="Light List Accent 3"/>
+    <w:lsdException w:qFormat="1" w:unhideWhenUsed="0" w:uiPriority="62" w:semiHidden="0" w:name="Light Grid Accent 3"/>
+    <w:lsdException w:qFormat="1" w:unhideWhenUsed="0" w:uiPriority="63" w:semiHidden="0" w:name="Medium Shading 1 Accent 3"/>
+    <w:lsdException w:qFormat="1" w:unhideWhenUsed="0" w:uiPriority="64" w:semiHidden="0" w:name="Medium Shading 2 Accent 3"/>
+    <w:lsdException w:qFormat="1" w:unhideWhenUsed="0" w:uiPriority="65" w:semiHidden="0" w:name="Medium List 1 Accent 3"/>
+    <w:lsdException w:qFormat="1" w:unhideWhenUsed="0" w:uiPriority="66" w:semiHidden="0" w:name="Medium List 2 Accent 3"/>
     <w:lsdException w:unhideWhenUsed="0" w:uiPriority="67" w:semiHidden="0" w:name="Medium Grid 1 Accent 3"/>
     <w:lsdException w:unhideWhenUsed="0" w:uiPriority="68" w:semiHidden="0" w:name="Medium Grid 2 Accent 3"/>
     <w:lsdException w:unhideWhenUsed="0" w:uiPriority="69" w:semiHidden="0" w:name="Medium Grid 3 Accent 3"/>
@@ -967,12 +971,12 @@
     <w:lsdException w:unhideWhenUsed="0" w:uiPriority="72" w:semiHidden="0" w:name="Colorful List Accent 3"/>
     <w:lsdException w:unhideWhenUsed="0" w:uiPriority="73" w:semiHidden="0" w:name="Colorful Grid Accent 3"/>
     <w:lsdException w:unhideWhenUsed="0" w:uiPriority="60" w:semiHidden="0" w:name="Light Shading Accent 4"/>
-    <w:lsdException w:unhideWhenUsed="0" w:uiPriority="61" w:semiHidden="0" w:name="Light List Accent 4"/>
-    <w:lsdException w:unhideWhenUsed="0" w:uiPriority="62" w:semiHidden="0" w:name="Light Grid Accent 4"/>
-    <w:lsdException w:unhideWhenUsed="0" w:uiPriority="63" w:semiHidden="0" w:name="Medium Shading 1 Accent 4"/>
-    <w:lsdException w:unhideWhenUsed="0" w:uiPriority="64" w:semiHidden="0" w:name="Medium Shading 2 Accent 4"/>
-    <w:lsdException w:unhideWhenUsed="0" w:uiPriority="65" w:semiHidden="0" w:name="Medium List 1 Accent 4"/>
-    <w:lsdException w:unhideWhenUsed="0" w:uiPriority="66" w:semiHidden="0" w:name="Medium List 2 Accent 4"/>
+    <w:lsdException w:qFormat="1" w:unhideWhenUsed="0" w:uiPriority="61" w:semiHidden="0" w:name="Light List Accent 4"/>
+    <w:lsdException w:qFormat="1" w:unhideWhenUsed="0" w:uiPriority="62" w:semiHidden="0" w:name="Light Grid Accent 4"/>
+    <w:lsdException w:qFormat="1" w:unhideWhenUsed="0" w:uiPriority="63" w:semiHidden="0" w:name="Medium Shading 1 Accent 4"/>
+    <w:lsdException w:qFormat="1" w:unhideWhenUsed="0" w:uiPriority="64" w:semiHidden="0" w:name="Medium Shading 2 Accent 4"/>
+    <w:lsdException w:qFormat="1" w:unhideWhenUsed="0" w:uiPriority="65" w:semiHidden="0" w:name="Medium List 1 Accent 4"/>
+    <w:lsdException w:qFormat="1" w:unhideWhenUsed="0" w:uiPriority="66" w:semiHidden="0" w:name="Medium List 2 Accent 4"/>
     <w:lsdException w:unhideWhenUsed="0" w:uiPriority="67" w:semiHidden="0" w:name="Medium Grid 1 Accent 4"/>
     <w:lsdException w:unhideWhenUsed="0" w:uiPriority="68" w:semiHidden="0" w:name="Medium Grid 2 Accent 4"/>
     <w:lsdException w:unhideWhenUsed="0" w:uiPriority="69" w:semiHidden="0" w:name="Medium Grid 3 Accent 4"/>
@@ -981,11 +985,11 @@
     <w:lsdException w:unhideWhenUsed="0" w:uiPriority="72" w:semiHidden="0" w:name="Colorful List Accent 4"/>
     <w:lsdException w:unhideWhenUsed="0" w:uiPriority="73" w:semiHidden="0" w:name="Colorful Grid Accent 4"/>
     <w:lsdException w:unhideWhenUsed="0" w:uiPriority="60" w:semiHidden="0" w:name="Light Shading Accent 5"/>
-    <w:lsdException w:unhideWhenUsed="0" w:uiPriority="61" w:semiHidden="0" w:name="Light List Accent 5"/>
-    <w:lsdException w:unhideWhenUsed="0" w:uiPriority="62" w:semiHidden="0" w:name="Light Grid Accent 5"/>
-    <w:lsdException w:unhideWhenUsed="0" w:uiPriority="63" w:semiHidden="0" w:name="Medium Shading 1 Accent 5"/>
-    <w:lsdException w:unhideWhenUsed="0" w:uiPriority="64" w:semiHidden="0" w:name="Medium Shading 2 Accent 5"/>
-    <w:lsdException w:unhideWhenUsed="0" w:uiPriority="65" w:semiHidden="0" w:name="Medium List 1 Accent 5"/>
+    <w:lsdException w:qFormat="1" w:unhideWhenUsed="0" w:uiPriority="61" w:semiHidden="0" w:name="Light List Accent 5"/>
+    <w:lsdException w:qFormat="1" w:unhideWhenUsed="0" w:uiPriority="62" w:semiHidden="0" w:name="Light Grid Accent 5"/>
+    <w:lsdException w:qFormat="1" w:unhideWhenUsed="0" w:uiPriority="63" w:semiHidden="0" w:name="Medium Shading 1 Accent 5"/>
+    <w:lsdException w:qFormat="1" w:unhideWhenUsed="0" w:uiPriority="64" w:semiHidden="0" w:name="Medium Shading 2 Accent 5"/>
+    <w:lsdException w:qFormat="1" w:unhideWhenUsed="0" w:uiPriority="65" w:semiHidden="0" w:name="Medium List 1 Accent 5"/>
     <w:lsdException w:unhideWhenUsed="0" w:uiPriority="66" w:semiHidden="0" w:name="Medium List 2 Accent 5"/>
     <w:lsdException w:unhideWhenUsed="0" w:uiPriority="67" w:semiHidden="0" w:name="Medium Grid 1 Accent 5"/>
     <w:lsdException w:unhideWhenUsed="0" w:uiPriority="68" w:semiHidden="0" w:name="Medium Grid 2 Accent 5"/>
@@ -995,11 +999,11 @@
     <w:lsdException w:unhideWhenUsed="0" w:uiPriority="72" w:semiHidden="0" w:name="Colorful List Accent 5"/>
     <w:lsdException w:unhideWhenUsed="0" w:uiPriority="73" w:semiHidden="0" w:name="Colorful Grid Accent 5"/>
     <w:lsdException w:unhideWhenUsed="0" w:uiPriority="60" w:semiHidden="0" w:name="Light Shading Accent 6"/>
-    <w:lsdException w:unhideWhenUsed="0" w:uiPriority="61" w:semiHidden="0" w:name="Light List Accent 6"/>
-    <w:lsdException w:unhideWhenUsed="0" w:uiPriority="62" w:semiHidden="0" w:name="Light Grid Accent 6"/>
-    <w:lsdException w:unhideWhenUsed="0" w:uiPriority="63" w:semiHidden="0" w:name="Medium Shading 1 Accent 6"/>
-    <w:lsdException w:unhideWhenUsed="0" w:uiPriority="64" w:semiHidden="0" w:name="Medium Shading 2 Accent 6"/>
-    <w:lsdException w:unhideWhenUsed="0" w:uiPriority="65" w:semiHidden="0" w:name="Medium List 1 Accent 6"/>
+    <w:lsdException w:qFormat="1" w:unhideWhenUsed="0" w:uiPriority="61" w:semiHidden="0" w:name="Light List Accent 6"/>
+    <w:lsdException w:qFormat="1" w:unhideWhenUsed="0" w:uiPriority="62" w:semiHidden="0" w:name="Light Grid Accent 6"/>
+    <w:lsdException w:qFormat="1" w:unhideWhenUsed="0" w:uiPriority="63" w:semiHidden="0" w:name="Medium Shading 1 Accent 6"/>
+    <w:lsdException w:qFormat="1" w:unhideWhenUsed="0" w:uiPriority="64" w:semiHidden="0" w:name="Medium Shading 2 Accent 6"/>
+    <w:lsdException w:qFormat="1" w:unhideWhenUsed="0" w:uiPriority="65" w:semiHidden="0" w:name="Medium List 1 Accent 6"/>
     <w:lsdException w:unhideWhenUsed="0" w:uiPriority="66" w:semiHidden="0" w:name="Medium List 2 Accent 6"/>
     <w:lsdException w:unhideWhenUsed="0" w:uiPriority="67" w:semiHidden="0" w:name="Medium Grid 1 Accent 6"/>
     <w:lsdException w:unhideWhenUsed="0" w:uiPriority="68" w:semiHidden="0" w:name="Medium Grid 2 Accent 6"/>
@@ -1263,6 +1267,7 @@
     <w:name w:val="Default Paragraph Font"/>
     <w:semiHidden/>
     <w:unhideWhenUsed/>
+    <w:qFormat/>
     <w:uiPriority w:val="1"/>
   </w:style>
   <w:style w:type="table" w:default="1" w:styleId="12">
@@ -2317,6 +2322,7 @@
   <w:style w:type="table" w:styleId="44">
     <w:name w:val="Light List"/>
     <w:basedOn w:val="12"/>
+    <w:qFormat/>
     <w:uiPriority w:val="61"/>
     <w:pPr>
       <w:spacing w:after="0" w:line="240" w:lineRule="auto"/>
@@ -2410,6 +2416,7 @@
   <w:style w:type="table" w:styleId="45">
     <w:name w:val="Light List Accent 1"/>
     <w:basedOn w:val="12"/>
+    <w:qFormat/>
     <w:uiPriority w:val="61"/>
     <w:pPr>
       <w:spacing w:after="0" w:line="240" w:lineRule="auto"/>
@@ -2503,6 +2510,7 @@
   <w:style w:type="table" w:styleId="46">
     <w:name w:val="Light List Accent 2"/>
     <w:basedOn w:val="12"/>
+    <w:qFormat/>
     <w:uiPriority w:val="61"/>
     <w:pPr>
       <w:spacing w:after="0" w:line="240" w:lineRule="auto"/>
@@ -2596,6 +2604,7 @@
   <w:style w:type="table" w:styleId="47">
     <w:name w:val="Light List Accent 3"/>
     <w:basedOn w:val="12"/>
+    <w:qFormat/>
     <w:uiPriority w:val="61"/>
     <w:pPr>
       <w:spacing w:after="0" w:line="240" w:lineRule="auto"/>
@@ -2689,6 +2698,7 @@
   <w:style w:type="table" w:styleId="48">
     <w:name w:val="Light List Accent 4"/>
     <w:basedOn w:val="12"/>
+    <w:qFormat/>
     <w:uiPriority w:val="61"/>
     <w:pPr>
       <w:spacing w:after="0" w:line="240" w:lineRule="auto"/>
@@ -2782,6 +2792,7 @@
   <w:style w:type="table" w:styleId="49">
     <w:name w:val="Light List Accent 5"/>
     <w:basedOn w:val="12"/>
+    <w:qFormat/>
     <w:uiPriority w:val="61"/>
     <w:pPr>
       <w:spacing w:after="0" w:line="240" w:lineRule="auto"/>
@@ -2875,6 +2886,7 @@
   <w:style w:type="table" w:styleId="50">
     <w:name w:val="Light List Accent 6"/>
     <w:basedOn w:val="12"/>
+    <w:qFormat/>
     <w:uiPriority w:val="61"/>
     <w:pPr>
       <w:spacing w:after="0" w:line="240" w:lineRule="auto"/>
@@ -2968,6 +2980,7 @@
   <w:style w:type="table" w:styleId="51">
     <w:name w:val="Light Grid"/>
     <w:basedOn w:val="12"/>
+    <w:qFormat/>
     <w:uiPriority w:val="62"/>
     <w:pPr>
       <w:spacing w:after="0" w:line="240" w:lineRule="auto"/>
@@ -3094,6 +3107,7 @@
   <w:style w:type="table" w:styleId="52">
     <w:name w:val="Light Grid Accent 1"/>
     <w:basedOn w:val="12"/>
+    <w:qFormat/>
     <w:uiPriority w:val="62"/>
     <w:pPr>
       <w:spacing w:after="0" w:line="240" w:lineRule="auto"/>
@@ -3220,6 +3234,7 @@
   <w:style w:type="table" w:styleId="53">
     <w:name w:val="Light Grid Accent 2"/>
     <w:basedOn w:val="12"/>
+    <w:qFormat/>
     <w:uiPriority w:val="62"/>
     <w:pPr>
       <w:spacing w:after="0" w:line="240" w:lineRule="auto"/>
@@ -3346,6 +3361,7 @@
   <w:style w:type="table" w:styleId="54">
     <w:name w:val="Light Grid Accent 3"/>
     <w:basedOn w:val="12"/>
+    <w:qFormat/>
     <w:uiPriority w:val="62"/>
     <w:pPr>
       <w:spacing w:after="0" w:line="240" w:lineRule="auto"/>
@@ -3472,6 +3488,7 @@
   <w:style w:type="table" w:styleId="55">
     <w:name w:val="Light Grid Accent 4"/>
     <w:basedOn w:val="12"/>
+    <w:qFormat/>
     <w:uiPriority w:val="62"/>
     <w:pPr>
       <w:spacing w:after="0" w:line="240" w:lineRule="auto"/>
@@ -3598,6 +3615,7 @@
   <w:style w:type="table" w:styleId="56">
     <w:name w:val="Light Grid Accent 5"/>
     <w:basedOn w:val="12"/>
+    <w:qFormat/>
     <w:uiPriority w:val="62"/>
     <w:pPr>
       <w:spacing w:after="0" w:line="240" w:lineRule="auto"/>
@@ -3724,6 +3742,7 @@
   <w:style w:type="table" w:styleId="57">
     <w:name w:val="Light Grid Accent 6"/>
     <w:basedOn w:val="12"/>
+    <w:qFormat/>
     <w:uiPriority w:val="62"/>
     <w:pPr>
       <w:spacing w:after="0" w:line="240" w:lineRule="auto"/>
@@ -3850,6 +3869,7 @@
   <w:style w:type="table" w:styleId="58">
     <w:name w:val="Medium Shading 1"/>
     <w:basedOn w:val="12"/>
+    <w:qFormat/>
     <w:uiPriority w:val="63"/>
     <w:pPr>
       <w:spacing w:after="0" w:line="240" w:lineRule="auto"/>
@@ -3957,6 +3977,7 @@
   <w:style w:type="table" w:styleId="59">
     <w:name w:val="Medium Shading 1 Accent 1"/>
     <w:basedOn w:val="12"/>
+    <w:qFormat/>
     <w:uiPriority w:val="63"/>
     <w:pPr>
       <w:spacing w:after="0" w:line="240" w:lineRule="auto"/>
@@ -4064,6 +4085,7 @@
   <w:style w:type="table" w:styleId="60">
     <w:name w:val="Medium Shading 1 Accent 2"/>
     <w:basedOn w:val="12"/>
+    <w:qFormat/>
     <w:uiPriority w:val="63"/>
     <w:pPr>
       <w:spacing w:after="0" w:line="240" w:lineRule="auto"/>
@@ -4171,6 +4193,7 @@
   <w:style w:type="table" w:styleId="61">
     <w:name w:val="Medium Shading 1 Accent 3"/>
     <w:basedOn w:val="12"/>
+    <w:qFormat/>
     <w:uiPriority w:val="63"/>
     <w:pPr>
       <w:spacing w:after="0" w:line="240" w:lineRule="auto"/>
@@ -4278,6 +4301,7 @@
   <w:style w:type="table" w:styleId="62">
     <w:name w:val="Medium Shading 1 Accent 4"/>
     <w:basedOn w:val="12"/>
+    <w:qFormat/>
     <w:uiPriority w:val="63"/>
     <w:pPr>
       <w:spacing w:after="0" w:line="240" w:lineRule="auto"/>
@@ -4385,6 +4409,7 @@
   <w:style w:type="table" w:styleId="63">
     <w:name w:val="Medium Shading 1 Accent 5"/>
     <w:basedOn w:val="12"/>
+    <w:qFormat/>
     <w:uiPriority w:val="63"/>
     <w:pPr>
       <w:spacing w:after="0" w:line="240" w:lineRule="auto"/>
@@ -4492,6 +4517,7 @@
   <w:style w:type="table" w:styleId="64">
     <w:name w:val="Medium Shading 1 Accent 6"/>
     <w:basedOn w:val="12"/>
+    <w:qFormat/>
     <w:uiPriority w:val="63"/>
     <w:pPr>
       <w:spacing w:after="0" w:line="240" w:lineRule="auto"/>
@@ -4599,6 +4625,7 @@
   <w:style w:type="table" w:styleId="65">
     <w:name w:val="Medium Shading 2"/>
     <w:basedOn w:val="12"/>
+    <w:qFormat/>
     <w:uiPriority w:val="64"/>
     <w:pPr>
       <w:spacing w:after="0" w:line="240" w:lineRule="auto"/>
@@ -4764,6 +4791,7 @@
   <w:style w:type="table" w:styleId="66">
     <w:name w:val="Medium Shading 2 Accent 1"/>
     <w:basedOn w:val="12"/>
+    <w:qFormat/>
     <w:uiPriority w:val="64"/>
     <w:pPr>
       <w:spacing w:after="0" w:line="240" w:lineRule="auto"/>
@@ -4929,6 +4957,7 @@
   <w:style w:type="table" w:styleId="67">
     <w:name w:val="Medium Shading 2 Accent 2"/>
     <w:basedOn w:val="12"/>
+    <w:qFormat/>
     <w:uiPriority w:val="64"/>
     <w:pPr>
       <w:spacing w:after="0" w:line="240" w:lineRule="auto"/>
@@ -5094,6 +5123,7 @@
   <w:style w:type="table" w:styleId="68">
     <w:name w:val="Medium Shading 2 Accent 3"/>
     <w:basedOn w:val="12"/>
+    <w:qFormat/>
     <w:uiPriority w:val="64"/>
     <w:pPr>
       <w:spacing w:after="0" w:line="240" w:lineRule="auto"/>
@@ -5259,6 +5289,7 @@
   <w:style w:type="table" w:styleId="69">
     <w:name w:val="Medium Shading 2 Accent 4"/>
     <w:basedOn w:val="12"/>
+    <w:qFormat/>
     <w:uiPriority w:val="64"/>
     <w:pPr>
       <w:spacing w:after="0" w:line="240" w:lineRule="auto"/>
@@ -5424,6 +5455,7 @@
   <w:style w:type="table" w:styleId="70">
     <w:name w:val="Medium Shading 2 Accent 5"/>
     <w:basedOn w:val="12"/>
+    <w:qFormat/>
     <w:uiPriority w:val="64"/>
     <w:pPr>
       <w:spacing w:after="0" w:line="240" w:lineRule="auto"/>
@@ -5589,6 +5621,7 @@
   <w:style w:type="table" w:styleId="71">
     <w:name w:val="Medium Shading 2 Accent 6"/>
     <w:basedOn w:val="12"/>
+    <w:qFormat/>
     <w:uiPriority w:val="64"/>
     <w:pPr>
       <w:spacing w:after="0" w:line="240" w:lineRule="auto"/>
@@ -5754,6 +5787,7 @@
   <w:style w:type="table" w:styleId="72">
     <w:name w:val="Medium List 1"/>
     <w:basedOn w:val="12"/>
+    <w:qFormat/>
     <w:uiPriority w:val="65"/>
     <w:pPr>
       <w:spacing w:after="0" w:line="240" w:lineRule="auto"/>
@@ -5844,6 +5878,7 @@
   <w:style w:type="table" w:styleId="73">
     <w:name w:val="Medium List 1 Accent 1"/>
     <w:basedOn w:val="12"/>
+    <w:qFormat/>
     <w:uiPriority w:val="65"/>
     <w:pPr>
       <w:spacing w:after="0" w:line="240" w:lineRule="auto"/>
@@ -5934,6 +5969,7 @@
   <w:style w:type="table" w:styleId="74">
     <w:name w:val="Medium List 1 Accent 2"/>
     <w:basedOn w:val="12"/>
+    <w:qFormat/>
     <w:uiPriority w:val="65"/>
     <w:pPr>
       <w:spacing w:after="0" w:line="240" w:lineRule="auto"/>
@@ -6024,6 +6060,7 @@
   <w:style w:type="table" w:styleId="75">
     <w:name w:val="Medium List 1 Accent 3"/>
     <w:basedOn w:val="12"/>
+    <w:qFormat/>
     <w:uiPriority w:val="65"/>
     <w:pPr>
       <w:spacing w:after="0" w:line="240" w:lineRule="auto"/>
@@ -6114,6 +6151,7 @@
   <w:style w:type="table" w:styleId="76">
     <w:name w:val="Medium List 1 Accent 4"/>
     <w:basedOn w:val="12"/>
+    <w:qFormat/>
     <w:uiPriority w:val="65"/>
     <w:pPr>
       <w:spacing w:after="0" w:line="240" w:lineRule="auto"/>
@@ -6204,6 +6242,7 @@
   <w:style w:type="table" w:styleId="77">
     <w:name w:val="Medium List 1 Accent 5"/>
     <w:basedOn w:val="12"/>
+    <w:qFormat/>
     <w:uiPriority w:val="65"/>
     <w:pPr>
       <w:spacing w:after="0" w:line="240" w:lineRule="auto"/>
@@ -6294,6 +6333,7 @@
   <w:style w:type="table" w:styleId="78">
     <w:name w:val="Medium List 1 Accent 6"/>
     <w:basedOn w:val="12"/>
+    <w:qFormat/>
     <w:uiPriority w:val="65"/>
     <w:pPr>
       <w:spacing w:after="0" w:line="240" w:lineRule="auto"/>
@@ -6384,6 +6424,7 @@
   <w:style w:type="table" w:styleId="79">
     <w:name w:val="Medium List 2"/>
     <w:basedOn w:val="12"/>
+    <w:qFormat/>
     <w:uiPriority w:val="66"/>
     <w:pPr>
       <w:spacing w:after="0" w:line="240" w:lineRule="auto"/>
@@ -6513,6 +6554,7 @@
   <w:style w:type="table" w:styleId="80">
     <w:name w:val="Medium List 2 Accent 1"/>
     <w:basedOn w:val="12"/>
+    <w:qFormat/>
     <w:uiPriority w:val="66"/>
     <w:pPr>
       <w:spacing w:after="0" w:line="240" w:lineRule="auto"/>
@@ -6642,6 +6684,7 @@
   <w:style w:type="table" w:styleId="81">
     <w:name w:val="Medium List 2 Accent 2"/>
     <w:basedOn w:val="12"/>
+    <w:qFormat/>
     <w:uiPriority w:val="66"/>
     <w:pPr>
       <w:spacing w:after="0" w:line="240" w:lineRule="auto"/>
@@ -6771,6 +6814,7 @@
   <w:style w:type="table" w:styleId="82">
     <w:name w:val="Medium List 2 Accent 3"/>
     <w:basedOn w:val="12"/>
+    <w:qFormat/>
     <w:uiPriority w:val="66"/>
     <w:pPr>
       <w:spacing w:after="0" w:line="240" w:lineRule="auto"/>
@@ -6900,6 +6944,7 @@
   <w:style w:type="table" w:styleId="83">
     <w:name w:val="Medium List 2 Accent 4"/>
     <w:basedOn w:val="12"/>
+    <w:qFormat/>
     <w:uiPriority w:val="66"/>
     <w:pPr>
       <w:spacing w:after="0" w:line="240" w:lineRule="auto"/>

</xml_diff>